<commit_message>
Add Composition Engine Menu system
- prompts/engine_menu.md: 10 engine options
- prompts/new_composition_template.md: new composition template
- tools/start_new_piece.md: workflow helper
- Composition_Engine_Guide: add menu section, v2.1
- Album_Composition_Index: record engine in update instructions

Made-with: Cursor
</commit_message>
<xml_diff>
--- a/docs/Composition_Engine_Guide.docx
+++ b/docs/Composition_Engine_Guide.docx
@@ -2,7 +2,7 @@
 <file path=word/document.xml><?xml version="1.0" encoding="utf-8"?>
 <w:document xmlns:w="http://schemas.openxmlformats.org/wordprocessingml/2006/main" xmlns:m="http://schemas.openxmlformats.org/officeDocument/2006/math" xmlns:r="http://schemas.openxmlformats.org/officeDocument/2006/relationships" xmlns:o="urn:schemas-microsoft-com:office:office" xmlns:v="urn:schemas-microsoft-com:vml" xmlns:w10="urn:schemas-microsoft-com:office:word" xmlns:a="http://schemas.openxmlformats.org/drawingml/2006/main" xmlns:pic="http://schemas.openxmlformats.org/drawingml/2006/picture" xmlns:wp="http://schemas.openxmlformats.org/drawingml/2006/wordprocessingDrawing">
   <w:body>
-    <w:bookmarkStart w:id="37" w:name="Xd877fd5a6305d268f3654482a76877abb9f7bd5"/>
+    <w:bookmarkStart w:id="38" w:name="Xd877fd5a6305d268f3654482a76877abb9f7bd5"/>
     <w:p>
       <w:pPr>
         <w:pStyle w:val="Heading1"/>
@@ -20,7 +20,7 @@
           <w:b/>
           <w:bCs/>
         </w:rPr>
-        <w:t xml:space="preserve">Version 2.0</w:t>
+        <w:t xml:space="preserve">Version 2.1</w:t>
       </w:r>
       <w:r>
         <w:br/>
@@ -112,6 +112,23 @@
           <w:numId w:val="1001"/>
         </w:numPr>
       </w:pPr>
+      <w:hyperlink w:anchor="composition-engine-menu">
+        <w:r>
+          <w:rPr>
+            <w:rStyle w:val="Hyperlink"/>
+          </w:rPr>
+          <w:t xml:space="preserve">Composition Engine Menu</w:t>
+        </w:r>
+      </w:hyperlink>
+    </w:p>
+    <w:p>
+      <w:pPr>
+        <w:pStyle w:val="Compact"/>
+        <w:numPr>
+          <w:ilvl w:val="0"/>
+          <w:numId w:val="1001"/>
+        </w:numPr>
+      </w:pPr>
       <w:hyperlink w:anchor="available-engines">
         <w:r>
           <w:rPr>
@@ -309,58 +326,81 @@
       </w:r>
     </w:p>
     <w:bookmarkEnd w:id="10"/>
-    <w:bookmarkStart w:id="17" w:name="available-engines"/>
+    <w:bookmarkStart w:id="11" w:name="composition-engine-menu"/>
     <w:p>
       <w:pPr>
         <w:pStyle w:val="Heading2"/>
       </w:pPr>
       <w:r>
-        <w:t xml:space="preserve">Available Engines</w:t>
-      </w:r>
-    </w:p>
-    <w:bookmarkStart w:id="11" w:name="frisell-atmosphere-engine"/>
-    <w:p>
-      <w:pPr>
-        <w:pStyle w:val="Heading3"/>
-      </w:pPr>
-      <w:r>
-        <w:t xml:space="preserve">Frisell Atmosphere Engine</w:t>
+        <w:t xml:space="preserve">Composition Engine Menu</w:t>
       </w:r>
     </w:p>
     <w:p>
       <w:pPr>
         <w:pStyle w:val="FirstParagraph"/>
+      </w:pPr>
+      <w:r>
+        <w:t xml:space="preserve">New pieces should begin by selecting an engine from the engine menu rather than writing prompts manually.</w:t>
+      </w:r>
+    </w:p>
+    <w:p>
+      <w:pPr>
+        <w:pStyle w:val="BodyText"/>
       </w:pPr>
       <w:r>
         <w:rPr>
           <w:b/>
           <w:bCs/>
         </w:rPr>
-        <w:t xml:space="preserve">Characteristics:</w:t>
-      </w:r>
-      <w:r>
-        <w:t xml:space="preserve"> </w:t>
-      </w:r>
-      <w:r>
-        <w:t xml:space="preserve">- Spacious harmony</w:t>
-      </w:r>
-      <w:r>
-        <w:t xml:space="preserve"> </w:t>
-      </w:r>
-      <w:r>
-        <w:t xml:space="preserve">- Floating tonal centres</w:t>
-      </w:r>
-      <w:r>
-        <w:t xml:space="preserve"> </w:t>
-      </w:r>
-      <w:r>
-        <w:t xml:space="preserve">- Strong guitar identity</w:t>
-      </w:r>
-      <w:r>
-        <w:t xml:space="preserve"> </w:t>
-      </w:r>
-      <w:r>
-        <w:t xml:space="preserve">- Evolving texture</w:t>
+        <w:t xml:space="preserve">Workflow:</w:t>
+      </w:r>
+      <w:r>
+        <w:t xml:space="preserve"> </w:t>
+      </w:r>
+      <w:r>
+        <w:t xml:space="preserve">1. Open</w:t>
+      </w:r>
+      <w:r>
+        <w:t xml:space="preserve"> </w:t>
+      </w:r>
+      <w:r>
+        <w:rPr>
+          <w:rStyle w:val="VerbatimChar"/>
+        </w:rPr>
+        <w:t xml:space="preserve">prompts/engine_menu.md</w:t>
+      </w:r>
+      <w:r>
+        <w:t xml:space="preserve"> </w:t>
+      </w:r>
+      <w:r>
+        <w:t xml:space="preserve">2. Choose an engine (single or dual-engine pairing)</w:t>
+      </w:r>
+      <w:r>
+        <w:t xml:space="preserve"> </w:t>
+      </w:r>
+      <w:r>
+        <w:t xml:space="preserve">3. Copy</w:t>
+      </w:r>
+      <w:r>
+        <w:t xml:space="preserve"> </w:t>
+      </w:r>
+      <w:r>
+        <w:rPr>
+          <w:rStyle w:val="VerbatimChar"/>
+        </w:rPr>
+        <w:t xml:space="preserve">prompts/new_composition_template.md</w:t>
+      </w:r>
+      <w:r>
+        <w:t xml:space="preserve"> </w:t>
+      </w:r>
+      <w:r>
+        <w:t xml:space="preserve">4. Fill in the fields (piece name, key, tempo, form, motif seed, etc.)</w:t>
+      </w:r>
+      <w:r>
+        <w:t xml:space="preserve"> </w:t>
+      </w:r>
+      <w:r>
+        <w:t xml:space="preserve">5. Run the composition generation</w:t>
       </w:r>
     </w:p>
     <w:p>
@@ -372,13 +412,13 @@
           <w:b/>
           <w:bCs/>
         </w:rPr>
-        <w:t xml:space="preserve">Best for:</w:t>
-      </w:r>
-      <w:r>
-        <w:t xml:space="preserve"> </w:t>
-      </w:r>
-      <w:r>
-        <w:t xml:space="preserve">ECM-style ballads, cinematic pieces</w:t>
+        <w:t xml:space="preserve">Engine menu options:</w:t>
+      </w:r>
+      <w:r>
+        <w:t xml:space="preserve"> </w:t>
+      </w:r>
+      <w:r>
+        <w:t xml:space="preserve">Frisell Atmosphere, Wayne Shorter, Slonimsky Harmonic, Andrew Hill, Counterpoint, Tonality Vault, Hybrid, Wayne Shorter + Zappa, Frisell + Counterpoint, Shorter + Slonimsky.</w:t>
       </w:r>
     </w:p>
     <w:p>
@@ -390,13 +430,28 @@
           <w:b/>
           <w:bCs/>
         </w:rPr>
-        <w:t xml:space="preserve">Album suitability:</w:t>
-      </w:r>
-      <w:r>
-        <w:t xml:space="preserve"> </w:t>
-      </w:r>
-      <w:r>
-        <w:t xml:space="preserve">10/10</w:t>
+        <w:t xml:space="preserve">Helper:</w:t>
+      </w:r>
+      <w:r>
+        <w:t xml:space="preserve"> </w:t>
+      </w:r>
+      <w:r>
+        <w:t xml:space="preserve">See</w:t>
+      </w:r>
+      <w:r>
+        <w:t xml:space="preserve"> </w:t>
+      </w:r>
+      <w:r>
+        <w:rPr>
+          <w:rStyle w:val="VerbatimChar"/>
+        </w:rPr>
+        <w:t xml:space="preserve">tools/start_new_piece.md</w:t>
+      </w:r>
+      <w:r>
+        <w:t xml:space="preserve"> </w:t>
+      </w:r>
+      <w:r>
+        <w:t xml:space="preserve">for step-by-step instructions.</w:t>
       </w:r>
     </w:p>
     <w:p>
@@ -407,13 +462,22 @@
       </w:r>
     </w:p>
     <w:bookmarkEnd w:id="11"/>
-    <w:bookmarkStart w:id="12" w:name="slonimsky-harmonic-engine"/>
+    <w:bookmarkStart w:id="18" w:name="available-engines"/>
+    <w:p>
+      <w:pPr>
+        <w:pStyle w:val="Heading2"/>
+      </w:pPr>
+      <w:r>
+        <w:t xml:space="preserve">Available Engines</w:t>
+      </w:r>
+    </w:p>
+    <w:bookmarkStart w:id="12" w:name="frisell-atmosphere-engine"/>
     <w:p>
       <w:pPr>
         <w:pStyle w:val="Heading3"/>
       </w:pPr>
       <w:r>
-        <w:t xml:space="preserve">Slonimsky Harmonic Engine</w:t>
+        <w:t xml:space="preserve">Frisell Atmosphere Engine</w:t>
       </w:r>
     </w:p>
     <w:p>
@@ -431,19 +495,25 @@
         <w:t xml:space="preserve"> </w:t>
       </w:r>
       <w:r>
-        <w:t xml:space="preserve">- Intervallic symmetry</w:t>
-      </w:r>
-      <w:r>
-        <w:t xml:space="preserve"> </w:t>
-      </w:r>
-      <w:r>
-        <w:t xml:space="preserve">- Exotic harmonic movement</w:t>
-      </w:r>
-      <w:r>
-        <w:t xml:space="preserve"> </w:t>
-      </w:r>
-      <w:r>
-        <w:t xml:space="preserve">- Surprising melodic intervals</w:t>
+        <w:t xml:space="preserve">- Spacious harmony</w:t>
+      </w:r>
+      <w:r>
+        <w:t xml:space="preserve"> </w:t>
+      </w:r>
+      <w:r>
+        <w:t xml:space="preserve">- Floating tonal centres</w:t>
+      </w:r>
+      <w:r>
+        <w:t xml:space="preserve"> </w:t>
+      </w:r>
+      <w:r>
+        <w:t xml:space="preserve">- Strong guitar identity</w:t>
+      </w:r>
+      <w:r>
+        <w:t xml:space="preserve"> </w:t>
+      </w:r>
+      <w:r>
+        <w:t xml:space="preserve">- Evolving texture</w:t>
       </w:r>
     </w:p>
     <w:p>
@@ -461,7 +531,7 @@
         <w:t xml:space="preserve"> </w:t>
       </w:r>
       <w:r>
-        <w:t xml:space="preserve">Modern jazz compositions, angular melodic writing</w:t>
+        <w:t xml:space="preserve">ECM-style ballads, cinematic pieces</w:t>
       </w:r>
     </w:p>
     <w:p>
@@ -479,7 +549,7 @@
         <w:t xml:space="preserve"> </w:t>
       </w:r>
       <w:r>
-        <w:t xml:space="preserve">8.5/10</w:t>
+        <w:t xml:space="preserve">10/10</w:t>
       </w:r>
     </w:p>
     <w:p>
@@ -490,13 +560,13 @@
       </w:r>
     </w:p>
     <w:bookmarkEnd w:id="12"/>
-    <w:bookmarkStart w:id="13" w:name="andrew-hill-engine"/>
+    <w:bookmarkStart w:id="13" w:name="slonimsky-harmonic-engine"/>
     <w:p>
       <w:pPr>
         <w:pStyle w:val="Heading3"/>
       </w:pPr>
       <w:r>
-        <w:t xml:space="preserve">Andrew Hill Engine</w:t>
+        <w:t xml:space="preserve">Slonimsky Harmonic Engine</w:t>
       </w:r>
     </w:p>
     <w:p>
@@ -514,19 +584,19 @@
         <w:t xml:space="preserve"> </w:t>
       </w:r>
       <w:r>
-        <w:t xml:space="preserve">- Asymmetric phrasing</w:t>
-      </w:r>
-      <w:r>
-        <w:t xml:space="preserve"> </w:t>
-      </w:r>
-      <w:r>
-        <w:t xml:space="preserve">- Unusual harmonic shifts</w:t>
-      </w:r>
-      <w:r>
-        <w:t xml:space="preserve"> </w:t>
-      </w:r>
-      <w:r>
-        <w:t xml:space="preserve">- Motivic mutation</w:t>
+        <w:t xml:space="preserve">- Intervallic symmetry</w:t>
+      </w:r>
+      <w:r>
+        <w:t xml:space="preserve"> </w:t>
+      </w:r>
+      <w:r>
+        <w:t xml:space="preserve">- Exotic harmonic movement</w:t>
+      </w:r>
+      <w:r>
+        <w:t xml:space="preserve"> </w:t>
+      </w:r>
+      <w:r>
+        <w:t xml:space="preserve">- Surprising melodic intervals</w:t>
       </w:r>
     </w:p>
     <w:p>
@@ -544,7 +614,7 @@
         <w:t xml:space="preserve"> </w:t>
       </w:r>
       <w:r>
-        <w:t xml:space="preserve">Experimental chamber jazz</w:t>
+        <w:t xml:space="preserve">Modern jazz compositions, angular melodic writing</w:t>
       </w:r>
     </w:p>
     <w:p>
@@ -562,7 +632,7 @@
         <w:t xml:space="preserve"> </w:t>
       </w:r>
       <w:r>
-        <w:t xml:space="preserve">8.7/10</w:t>
+        <w:t xml:space="preserve">8.5/10</w:t>
       </w:r>
     </w:p>
     <w:p>
@@ -573,13 +643,13 @@
       </w:r>
     </w:p>
     <w:bookmarkEnd w:id="13"/>
-    <w:bookmarkStart w:id="14" w:name="tonality-vault-engine"/>
+    <w:bookmarkStart w:id="14" w:name="andrew-hill-engine"/>
     <w:p>
       <w:pPr>
         <w:pStyle w:val="Heading3"/>
       </w:pPr>
       <w:r>
-        <w:t xml:space="preserve">Tonality Vault Engine</w:t>
+        <w:t xml:space="preserve">Andrew Hill Engine</w:t>
       </w:r>
     </w:p>
     <w:p>
@@ -597,13 +667,19 @@
         <w:t xml:space="preserve"> </w:t>
       </w:r>
       <w:r>
-        <w:t xml:space="preserve">- Rotating tonal systems</w:t>
-      </w:r>
-      <w:r>
-        <w:t xml:space="preserve"> </w:t>
-      </w:r>
-      <w:r>
-        <w:t xml:space="preserve">- Large harmonic palette</w:t>
+        <w:t xml:space="preserve">- Asymmetric phrasing</w:t>
+      </w:r>
+      <w:r>
+        <w:t xml:space="preserve"> </w:t>
+      </w:r>
+      <w:r>
+        <w:t xml:space="preserve">- Unusual harmonic shifts</w:t>
+      </w:r>
+      <w:r>
+        <w:t xml:space="preserve"> </w:t>
+      </w:r>
+      <w:r>
+        <w:t xml:space="preserve">- Motivic mutation</w:t>
       </w:r>
     </w:p>
     <w:p>
@@ -621,7 +697,7 @@
         <w:t xml:space="preserve"> </w:t>
       </w:r>
       <w:r>
-        <w:t xml:space="preserve">Large-scale compositions</w:t>
+        <w:t xml:space="preserve">Experimental chamber jazz</w:t>
       </w:r>
     </w:p>
     <w:p>
@@ -639,7 +715,7 @@
         <w:t xml:space="preserve"> </w:t>
       </w:r>
       <w:r>
-        <w:t xml:space="preserve">9/10</w:t>
+        <w:t xml:space="preserve">8.7/10</w:t>
       </w:r>
     </w:p>
     <w:p>
@@ -650,13 +726,13 @@
       </w:r>
     </w:p>
     <w:bookmarkEnd w:id="14"/>
-    <w:bookmarkStart w:id="15" w:name="counterpoint-engine"/>
+    <w:bookmarkStart w:id="15" w:name="tonality-vault-engine"/>
     <w:p>
       <w:pPr>
         <w:pStyle w:val="Heading3"/>
       </w:pPr>
       <w:r>
-        <w:t xml:space="preserve">Counterpoint Engine</w:t>
+        <w:t xml:space="preserve">Tonality Vault Engine</w:t>
       </w:r>
     </w:p>
     <w:p>
@@ -674,13 +750,13 @@
         <w:t xml:space="preserve"> </w:t>
       </w:r>
       <w:r>
-        <w:t xml:space="preserve">- Independent melodic lines</w:t>
-      </w:r>
-      <w:r>
-        <w:t xml:space="preserve"> </w:t>
-      </w:r>
-      <w:r>
-        <w:t xml:space="preserve">- Evolving ensemble interaction</w:t>
+        <w:t xml:space="preserve">- Rotating tonal systems</w:t>
+      </w:r>
+      <w:r>
+        <w:t xml:space="preserve"> </w:t>
+      </w:r>
+      <w:r>
+        <w:t xml:space="preserve">- Large harmonic palette</w:t>
       </w:r>
     </w:p>
     <w:p>
@@ -698,7 +774,7 @@
         <w:t xml:space="preserve"> </w:t>
       </w:r>
       <w:r>
-        <w:t xml:space="preserve">String-driven compositions</w:t>
+        <w:t xml:space="preserve">Large-scale compositions</w:t>
       </w:r>
     </w:p>
     <w:p>
@@ -716,7 +792,7 @@
         <w:t xml:space="preserve"> </w:t>
       </w:r>
       <w:r>
-        <w:t xml:space="preserve">9.2/10</w:t>
+        <w:t xml:space="preserve">9/10</w:t>
       </w:r>
     </w:p>
     <w:p>
@@ -727,13 +803,13 @@
       </w:r>
     </w:p>
     <w:bookmarkEnd w:id="15"/>
-    <w:bookmarkStart w:id="16" w:name="wayne-shorter-engine"/>
+    <w:bookmarkStart w:id="16" w:name="counterpoint-engine"/>
     <w:p>
       <w:pPr>
         <w:pStyle w:val="Heading3"/>
       </w:pPr>
       <w:r>
-        <w:t xml:space="preserve">Wayne Shorter Engine</w:t>
+        <w:t xml:space="preserve">Counterpoint Engine</w:t>
       </w:r>
     </w:p>
     <w:p>
@@ -751,43 +827,13 @@
         <w:t xml:space="preserve"> </w:t>
       </w:r>
       <w:r>
-        <w:t xml:space="preserve">- Narrative harmony</w:t>
-      </w:r>
-      <w:r>
-        <w:t xml:space="preserve"> </w:t>
-      </w:r>
-      <w:r>
-        <w:t xml:space="preserve">- Evolving motifs</w:t>
-      </w:r>
-      <w:r>
-        <w:t xml:space="preserve"> </w:t>
-      </w:r>
-      <w:r>
-        <w:t xml:space="preserve">- Dramatic structural arcs</w:t>
-      </w:r>
-      <w:r>
-        <w:t xml:space="preserve"> </w:t>
-      </w:r>
-      <w:r>
-        <w:t xml:space="preserve">- Motifs evolve rather than repeat</w:t>
-      </w:r>
-      <w:r>
-        <w:t xml:space="preserve"> </w:t>
-      </w:r>
-      <w:r>
-        <w:t xml:space="preserve">- Harmony behaves narratively rather than functionally</w:t>
-      </w:r>
-      <w:r>
-        <w:t xml:space="preserve"> </w:t>
-      </w:r>
-      <w:r>
-        <w:t xml:space="preserve">- Phrases often asymmetrical (5, 7, 9 bar groupings)</w:t>
-      </w:r>
-      <w:r>
-        <w:t xml:space="preserve"> </w:t>
-      </w:r>
-      <w:r>
-        <w:t xml:space="preserve">- Melody leads harmony</w:t>
+        <w:t xml:space="preserve">- Independent melodic lines</w:t>
+      </w:r>
+      <w:r>
+        <w:t xml:space="preserve"> </w:t>
+      </w:r>
+      <w:r>
+        <w:t xml:space="preserve">- Evolving ensemble interaction</w:t>
       </w:r>
     </w:p>
     <w:p>
@@ -805,7 +851,7 @@
         <w:t xml:space="preserve"> </w:t>
       </w:r>
       <w:r>
-        <w:t xml:space="preserve">Sophisticated modern jazz chamber music</w:t>
+        <w:t xml:space="preserve">String-driven compositions</w:t>
       </w:r>
     </w:p>
     <w:p>
@@ -823,28 +869,7 @@
         <w:t xml:space="preserve"> </w:t>
       </w:r>
       <w:r>
-        <w:t xml:space="preserve">9.6/10</w:t>
-      </w:r>
-    </w:p>
-    <w:p>
-      <w:pPr>
-        <w:pStyle w:val="BodyText"/>
-      </w:pPr>
-      <w:r>
-        <w:rPr>
-          <w:b/>
-          <w:bCs/>
-        </w:rPr>
-        <w:t xml:space="preserve">Full specification:</w:t>
-      </w:r>
-      <w:r>
-        <w:t xml:space="preserve"> </w:t>
-      </w:r>
-      <w:r>
-        <w:rPr>
-          <w:rStyle w:val="VerbatimChar"/>
-        </w:rPr>
-        <w:t xml:space="preserve">rules/wayne-shorter-composition-engine.md</w:t>
+        <w:t xml:space="preserve">9.2/10</w:t>
       </w:r>
     </w:p>
     <w:p>
@@ -855,14 +880,13 @@
       </w:r>
     </w:p>
     <w:bookmarkEnd w:id="16"/>
-    <w:bookmarkEnd w:id="17"/>
-    <w:bookmarkStart w:id="22" w:name="dual-engine-mode"/>
-    <w:p>
-      <w:pPr>
-        <w:pStyle w:val="Heading2"/>
-      </w:pPr>
-      <w:r>
-        <w:t xml:space="preserve">Dual Engine Mode</w:t>
+    <w:bookmarkStart w:id="17" w:name="wayne-shorter-engine"/>
+    <w:p>
+      <w:pPr>
+        <w:pStyle w:val="Heading3"/>
+      </w:pPr>
+      <w:r>
+        <w:t xml:space="preserve">Wayne Shorter Engine</w:t>
       </w:r>
     </w:p>
     <w:p>
@@ -874,6 +898,96 @@
           <w:b/>
           <w:bCs/>
         </w:rPr>
+        <w:t xml:space="preserve">Characteristics:</w:t>
+      </w:r>
+      <w:r>
+        <w:t xml:space="preserve"> </w:t>
+      </w:r>
+      <w:r>
+        <w:t xml:space="preserve">- Narrative harmony</w:t>
+      </w:r>
+      <w:r>
+        <w:t xml:space="preserve"> </w:t>
+      </w:r>
+      <w:r>
+        <w:t xml:space="preserve">- Evolving motifs</w:t>
+      </w:r>
+      <w:r>
+        <w:t xml:space="preserve"> </w:t>
+      </w:r>
+      <w:r>
+        <w:t xml:space="preserve">- Dramatic structural arcs</w:t>
+      </w:r>
+      <w:r>
+        <w:t xml:space="preserve"> </w:t>
+      </w:r>
+      <w:r>
+        <w:t xml:space="preserve">- Motifs evolve rather than repeat</w:t>
+      </w:r>
+      <w:r>
+        <w:t xml:space="preserve"> </w:t>
+      </w:r>
+      <w:r>
+        <w:t xml:space="preserve">- Harmony behaves narratively rather than functionally</w:t>
+      </w:r>
+      <w:r>
+        <w:t xml:space="preserve"> </w:t>
+      </w:r>
+      <w:r>
+        <w:t xml:space="preserve">- Phrases often asymmetrical (5, 7, 9 bar groupings)</w:t>
+      </w:r>
+      <w:r>
+        <w:t xml:space="preserve"> </w:t>
+      </w:r>
+      <w:r>
+        <w:t xml:space="preserve">- Melody leads harmony</w:t>
+      </w:r>
+    </w:p>
+    <w:p>
+      <w:pPr>
+        <w:pStyle w:val="BodyText"/>
+      </w:pPr>
+      <w:r>
+        <w:rPr>
+          <w:b/>
+          <w:bCs/>
+        </w:rPr>
+        <w:t xml:space="preserve">Best for:</w:t>
+      </w:r>
+      <w:r>
+        <w:t xml:space="preserve"> </w:t>
+      </w:r>
+      <w:r>
+        <w:t xml:space="preserve">Sophisticated modern jazz chamber music</w:t>
+      </w:r>
+    </w:p>
+    <w:p>
+      <w:pPr>
+        <w:pStyle w:val="BodyText"/>
+      </w:pPr>
+      <w:r>
+        <w:rPr>
+          <w:b/>
+          <w:bCs/>
+        </w:rPr>
+        <w:t xml:space="preserve">Album suitability:</w:t>
+      </w:r>
+      <w:r>
+        <w:t xml:space="preserve"> </w:t>
+      </w:r>
+      <w:r>
+        <w:t xml:space="preserve">9.6/10</w:t>
+      </w:r>
+    </w:p>
+    <w:p>
+      <w:pPr>
+        <w:pStyle w:val="BodyText"/>
+      </w:pPr>
+      <w:r>
+        <w:rPr>
+          <w:b/>
+          <w:bCs/>
+        </w:rPr>
         <w:t xml:space="preserve">Full specification:</w:t>
       </w:r>
       <w:r>
@@ -883,6 +997,45 @@
         <w:rPr>
           <w:rStyle w:val="VerbatimChar"/>
         </w:rPr>
+        <w:t xml:space="preserve">rules/wayne-shorter-composition-engine.md</w:t>
+      </w:r>
+    </w:p>
+    <w:p>
+      <w:r>
+        <w:pict>
+          <v:rect style="width:0;height:1.5pt" o:hralign="center" o:hrstd="t" o:hr="t"/>
+        </w:pict>
+      </w:r>
+    </w:p>
+    <w:bookmarkEnd w:id="17"/>
+    <w:bookmarkEnd w:id="18"/>
+    <w:bookmarkStart w:id="23" w:name="dual-engine-mode"/>
+    <w:p>
+      <w:pPr>
+        <w:pStyle w:val="Heading2"/>
+      </w:pPr>
+      <w:r>
+        <w:t xml:space="preserve">Dual Engine Mode</w:t>
+      </w:r>
+    </w:p>
+    <w:p>
+      <w:pPr>
+        <w:pStyle w:val="FirstParagraph"/>
+      </w:pPr>
+      <w:r>
+        <w:rPr>
+          <w:b/>
+          <w:bCs/>
+        </w:rPr>
+        <w:t xml:space="preserve">Full specification:</w:t>
+      </w:r>
+      <w:r>
+        <w:t xml:space="preserve"> </w:t>
+      </w:r>
+      <w:r>
+        <w:rPr>
+          <w:rStyle w:val="VerbatimChar"/>
+        </w:rPr>
         <w:t xml:space="preserve">rules/dual-engine-composition-mode.md</w:t>
       </w:r>
     </w:p>
@@ -894,7 +1047,7 @@
         <w:t xml:space="preserve">Dual engine mode uses two engines simultaneously with distinct roles.</w:t>
       </w:r>
     </w:p>
-    <w:bookmarkStart w:id="18" w:name="engine-roles"/>
+    <w:bookmarkStart w:id="19" w:name="engine-roles"/>
     <w:p>
       <w:pPr>
         <w:pStyle w:val="Heading3"/>
@@ -997,8 +1150,8 @@
         </w:tc>
       </w:tr>
     </w:tbl>
-    <w:bookmarkEnd w:id="18"/>
-    <w:bookmarkStart w:id="19" w:name="generation-logic"/>
+    <w:bookmarkEnd w:id="19"/>
+    <w:bookmarkStart w:id="20" w:name="generation-logic"/>
     <w:p>
       <w:pPr>
         <w:pStyle w:val="Heading3"/>
@@ -1043,8 +1196,8 @@
         <w:t xml:space="preserve">Combine both into a unified structural design</w:t>
       </w:r>
     </w:p>
-    <w:bookmarkEnd w:id="19"/>
-    <w:bookmarkStart w:id="20" w:name="validation"/>
+    <w:bookmarkEnd w:id="20"/>
+    <w:bookmarkStart w:id="21" w:name="validation"/>
     <w:p>
       <w:pPr>
         <w:pStyle w:val="Heading3"/>
@@ -1081,8 +1234,8 @@
         <w:t xml:space="preserve">If either engine influence is weak, regenerate.</w:t>
       </w:r>
     </w:p>
-    <w:bookmarkEnd w:id="20"/>
-    <w:bookmarkStart w:id="21" w:name="example-pairings"/>
+    <w:bookmarkEnd w:id="21"/>
+    <w:bookmarkStart w:id="22" w:name="example-pairings"/>
     <w:p>
       <w:pPr>
         <w:pStyle w:val="Heading3"/>
@@ -1170,9 +1323,9 @@
         </w:pict>
       </w:r>
     </w:p>
-    <w:bookmarkEnd w:id="21"/>
     <w:bookmarkEnd w:id="22"/>
-    <w:bookmarkStart w:id="23" w:name="secondary-engine-support-zappa"/>
+    <w:bookmarkEnd w:id="23"/>
+    <w:bookmarkStart w:id="24" w:name="secondary-engine-support-zappa"/>
     <w:p>
       <w:pPr>
         <w:pStyle w:val="Heading2"/>
@@ -1308,8 +1461,8 @@
         </w:pict>
       </w:r>
     </w:p>
-    <w:bookmarkEnd w:id="23"/>
-    <w:bookmarkStart w:id="24" w:name="hybrid-engine"/>
+    <w:bookmarkEnd w:id="24"/>
+    <w:bookmarkStart w:id="25" w:name="hybrid-engine"/>
     <w:p>
       <w:pPr>
         <w:pStyle w:val="Heading2"/>
@@ -1385,8 +1538,8 @@
         </w:pict>
       </w:r>
     </w:p>
-    <w:bookmarkEnd w:id="24"/>
-    <w:bookmarkStart w:id="29" w:name="score-readability-standards"/>
+    <w:bookmarkEnd w:id="25"/>
+    <w:bookmarkStart w:id="30" w:name="score-readability-standards"/>
     <w:p>
       <w:pPr>
         <w:pStyle w:val="Heading2"/>
@@ -1424,7 +1577,7 @@
         <w:t xml:space="preserve">All MusicXML exports must follow professional rehearsal chart standards.</w:t>
       </w:r>
     </w:p>
-    <w:bookmarkStart w:id="25" w:name="chord-symbols-mandatory"/>
+    <w:bookmarkStart w:id="26" w:name="chord-symbols-mandatory"/>
     <w:p>
       <w:pPr>
         <w:pStyle w:val="Heading3"/>
@@ -1481,8 +1634,8 @@
         <w:t xml:space="preserve">Standard lead-sheet format (e.g. Dmaj7, G6, A7sus4, Bm9, Fmaj7#11)</w:t>
       </w:r>
     </w:p>
-    <w:bookmarkEnd w:id="25"/>
-    <w:bookmarkStart w:id="26" w:name="boxed-section-letters"/>
+    <w:bookmarkEnd w:id="26"/>
+    <w:bookmarkStart w:id="27" w:name="boxed-section-letters"/>
     <w:p>
       <w:pPr>
         <w:pStyle w:val="Heading3"/>
@@ -1599,8 +1752,8 @@
         <w:t xml:space="preserve">Sections typically ≥ 6 bars</w:t>
       </w:r>
     </w:p>
-    <w:bookmarkEnd w:id="26"/>
-    <w:bookmarkStart w:id="27" w:name="rehearsal-friendly-layout"/>
+    <w:bookmarkEnd w:id="27"/>
+    <w:bookmarkStart w:id="28" w:name="rehearsal-friendly-layout"/>
     <w:p>
       <w:pPr>
         <w:pStyle w:val="Heading3"/>
@@ -1657,8 +1810,8 @@
         <w:t xml:space="preserve">Dynamic markings at texture changes</w:t>
       </w:r>
     </w:p>
-    <w:bookmarkEnd w:id="27"/>
-    <w:bookmarkStart w:id="28" w:name="part-clarity"/>
+    <w:bookmarkEnd w:id="28"/>
+    <w:bookmarkStart w:id="29" w:name="part-clarity"/>
     <w:p>
       <w:pPr>
         <w:pStyle w:val="Heading3"/>
@@ -1832,9 +1985,9 @@
         </w:pict>
       </w:r>
     </w:p>
-    <w:bookmarkEnd w:id="28"/>
     <w:bookmarkEnd w:id="29"/>
-    <w:bookmarkStart w:id="34" w:name="composition-rules"/>
+    <w:bookmarkEnd w:id="30"/>
+    <w:bookmarkStart w:id="35" w:name="composition-rules"/>
     <w:p>
       <w:pPr>
         <w:pStyle w:val="Heading2"/>
@@ -1843,7 +1996,7 @@
         <w:t xml:space="preserve">Composition Rules</w:t>
       </w:r>
     </w:p>
-    <w:bookmarkStart w:id="30" w:name="guitar-first-rule"/>
+    <w:bookmarkStart w:id="31" w:name="guitar-first-rule"/>
     <w:p>
       <w:pPr>
         <w:pStyle w:val="Heading3"/>
@@ -1982,8 +2135,8 @@
         </w:pict>
       </w:r>
     </w:p>
-    <w:bookmarkEnd w:id="30"/>
-    <w:bookmarkStart w:id="31" w:name="anti-monotony-rule"/>
+    <w:bookmarkEnd w:id="31"/>
+    <w:bookmarkStart w:id="32" w:name="anti-monotony-rule"/>
     <w:p>
       <w:pPr>
         <w:pStyle w:val="Heading3"/>
@@ -2080,8 +2233,8 @@
         </w:pict>
       </w:r>
     </w:p>
-    <w:bookmarkEnd w:id="31"/>
-    <w:bookmarkStart w:id="32" w:name="structural-evolution-engine"/>
+    <w:bookmarkEnd w:id="32"/>
+    <w:bookmarkStart w:id="33" w:name="structural-evolution-engine"/>
     <w:p>
       <w:pPr>
         <w:pStyle w:val="Heading3"/>
@@ -2192,8 +2345,8 @@
         </w:pict>
       </w:r>
     </w:p>
-    <w:bookmarkEnd w:id="32"/>
-    <w:bookmarkStart w:id="33" w:name="repetition-fatigue-rule"/>
+    <w:bookmarkEnd w:id="33"/>
+    <w:bookmarkStart w:id="34" w:name="repetition-fatigue-rule"/>
     <w:p>
       <w:pPr>
         <w:pStyle w:val="Heading3"/>
@@ -2278,9 +2431,9 @@
         </w:pict>
       </w:r>
     </w:p>
-    <w:bookmarkEnd w:id="33"/>
     <w:bookmarkEnd w:id="34"/>
-    <w:bookmarkStart w:id="35" w:name="engine-combinations"/>
+    <w:bookmarkEnd w:id="35"/>
+    <w:bookmarkStart w:id="36" w:name="engine-combinations"/>
     <w:p>
       <w:pPr>
         <w:pStyle w:val="Heading2"/>
@@ -2591,8 +2744,8 @@
         </w:pict>
       </w:r>
     </w:p>
-    <w:bookmarkEnd w:id="35"/>
-    <w:bookmarkStart w:id="36" w:name="reference-locations"/>
+    <w:bookmarkEnd w:id="36"/>
+    <w:bookmarkStart w:id="37" w:name="reference-locations"/>
     <w:p>
       <w:pPr>
         <w:pStyle w:val="Heading2"/>
@@ -2647,6 +2800,87 @@
               <w:pStyle w:val="Compact"/>
             </w:pPr>
             <w:r>
+              <w:t xml:space="preserve">Engine menu</w:t>
+            </w:r>
+          </w:p>
+        </w:tc>
+        <w:tc>
+          <w:tcPr/>
+          <w:p>
+            <w:pPr>
+              <w:pStyle w:val="Compact"/>
+            </w:pPr>
+            <w:r>
+              <w:rPr>
+                <w:rStyle w:val="VerbatimChar"/>
+              </w:rPr>
+              <w:t xml:space="preserve">prompts/engine_menu.md</w:t>
+            </w:r>
+          </w:p>
+        </w:tc>
+      </w:tr>
+      <w:tr>
+        <w:tc>
+          <w:tcPr/>
+          <w:p>
+            <w:pPr>
+              <w:pStyle w:val="Compact"/>
+            </w:pPr>
+            <w:r>
+              <w:t xml:space="preserve">New composition template</w:t>
+            </w:r>
+          </w:p>
+        </w:tc>
+        <w:tc>
+          <w:tcPr/>
+          <w:p>
+            <w:pPr>
+              <w:pStyle w:val="Compact"/>
+            </w:pPr>
+            <w:r>
+              <w:rPr>
+                <w:rStyle w:val="VerbatimChar"/>
+              </w:rPr>
+              <w:t xml:space="preserve">prompts/new_composition_template.md</w:t>
+            </w:r>
+          </w:p>
+        </w:tc>
+      </w:tr>
+      <w:tr>
+        <w:tc>
+          <w:tcPr/>
+          <w:p>
+            <w:pPr>
+              <w:pStyle w:val="Compact"/>
+            </w:pPr>
+            <w:r>
+              <w:t xml:space="preserve">Start new piece helper</w:t>
+            </w:r>
+          </w:p>
+        </w:tc>
+        <w:tc>
+          <w:tcPr/>
+          <w:p>
+            <w:pPr>
+              <w:pStyle w:val="Compact"/>
+            </w:pPr>
+            <w:r>
+              <w:rPr>
+                <w:rStyle w:val="VerbatimChar"/>
+              </w:rPr>
+              <w:t xml:space="preserve">tools/start_new_piece.md</w:t>
+            </w:r>
+          </w:p>
+        </w:tc>
+      </w:tr>
+      <w:tr>
+        <w:tc>
+          <w:tcPr/>
+          <w:p>
+            <w:pPr>
+              <w:pStyle w:val="Compact"/>
+            </w:pPr>
+            <w:r>
               <w:t xml:space="preserve">Master composition engine</w:t>
             </w:r>
           </w:p>
@@ -2983,8 +3217,8 @@
         <w:t xml:space="preserve">This guide is synchronized with the rule system. Update when engines or rules change.</w:t>
       </w:r>
     </w:p>
-    <w:bookmarkEnd w:id="36"/>
     <w:bookmarkEnd w:id="37"/>
+    <w:bookmarkEnd w:id="38"/>
     <w:sectPr>
       <w:footnotePr>
         <w:numRestart w:val="eachSect"/>

</xml_diff>